<commit_message>
GasLib-40 results: add §6.9 (three-network validation) + refresh deliverables
Full GasLib-40-derived run (150k/3 seeds/6 scenarios, models/exports/paper_gaslib/).
On the real-geometry network the distilled controller is the best learned method
outright: Distilled-MPC 5.26 / 0 violations / 2.8 ms — matches the GA optimum (5.57),
beats MPC (6.70). DP/MPC clean (0 viol; chain topology keeps the 3-D grid valid).
Constraint-aware SAC's reliability advantage reappears (tightest terminal gap 66, lowest
variance). Feasibility transfers a third time.

- paper/draft.md: add §6.9 + Table 3 + Figure 6; update §5/abstract/conclusion/limitations
  to three-network validation. Regenerated paper/draft.docx (6 figures).
- raw_data/gaslib/ + refreshed raw_data.zip + README.
- PR_DESCRIPTION.md / PR_summary.docx updated to three networks.

Co-Authored-By: Claude Opus 4.8 <noreply@anthropic.com>
</commit_message>
<xml_diff>
--- a/paper/PR_summary.docx
+++ b/paper/PR_summary.docx
@@ -324,13 +324,13 @@
           <w:b/>
           <w:bCs/>
         </w:rPr>
-        <w:t xml:space="preserve">Two-network benchmark.</w:t>
-      </w:r>
-      <w:r>
-        <w:t xml:space="preserve"> </w:t>
-      </w:r>
-      <w:r>
-        <w:t xml:space="preserve">Rule-based, GA, DP, receding-horizon MPC, SAC/TD3/PPO, Constrained-SAC and Distilled-MPC, all on one objective, with multi-seed statistics, robustness under perturbation, and an honest discussion. Validated on a gun-barrel element</w:t>
+        <w:t xml:space="preserve">Three-network benchmark.</w:t>
+      </w:r>
+      <w:r>
+        <w:t xml:space="preserve"> </w:t>
+      </w:r>
+      <w:r>
+        <w:t xml:space="preserve">Rule-based, GA, DP, receding-horizon MPC, SAC/TD3/PPO, Constrained-SAC and Distilled-MPC, all on one objective, with multi-seed statistics, robustness under perturbation, and an honest discussion. Validated on (i) a gun-barrel element, (ii) a branched benchmark, and (iii) a sub-network with</w:t>
       </w:r>
       <w:r>
         <w:t xml:space="preserve"> </w:t>
@@ -340,13 +340,10 @@
           <w:b/>
           <w:bCs/>
         </w:rPr>
-        <w:t xml:space="preserve">and</w:t>
-      </w:r>
-      <w:r>
-        <w:t xml:space="preserve"> </w:t>
-      </w:r>
-      <w:r>
-        <w:t xml:space="preserve">a branched benchmark with transmission-scale pipe parameters; the env/DP/MPC/distillation are all generalised to arbitrary single-compressor topologies (N-D DP).</w:t>
+        <w:t xml:space="preserve">native pipe geometry from the real GasLib-40 instance</w:t>
+      </w:r>
+      <w:r>
+        <w:t xml:space="preserve">; the env/DP/MPC/distillation are all generalised to arbitrary single-compressor topologies (N-D DP).</w:t>
       </w:r>
     </w:p>
     <w:bookmarkEnd w:id="10"/>
@@ -1038,7 +1035,408 @@
         <w:pStyle w:val="BodyText"/>
       </w:pPr>
       <w:r>
-        <w:t xml:space="preserve">Honest caveats (in the paper): the constraint-aware-SAC ranking is network-dependent; the 3-D grid DP/MPC are grid-limited (~2 violations) so GA is the clean reference on the branch; TD3 degenerates (never compresses → depletes line-pack), which the terminal-gap column exposes.</w:t>
+        <w:rPr>
+          <w:b/>
+          <w:bCs/>
+        </w:rPr>
+        <w:t xml:space="preserve">GasLib-40-derived network</w:t>
+      </w:r>
+      <w:r>
+        <w:t xml:space="preserve"> </w:t>
+      </w:r>
+      <w:r>
+        <w:t xml:space="preserve">(real pipe geometry) — the cleanest case for the method:</w:t>
+      </w:r>
+    </w:p>
+    <w:tbl>
+      <w:tblPr>
+        <w:tblStyle w:val="Table"/>
+        <w:tblW w:type="auto" w:w="0"/>
+        <w:tblLook w:firstRow="1" w:lastRow="0" w:firstColumn="0" w:lastColumn="0" w:noHBand="0" w:noVBand="0" w:val="0020"/>
+      </w:tblPr>
+      <w:tblGrid>
+        <w:gridCol w:w="1584"/>
+        <w:gridCol w:w="1584"/>
+        <w:gridCol w:w="1584"/>
+        <w:gridCol w:w="1584"/>
+        <w:gridCol w:w="1584"/>
+      </w:tblGrid>
+      <w:tr>
+        <w:trPr>
+          <w:tblHeader w:val="on"/>
+        </w:trPr>
+        <w:tc>
+          <w:tcPr/>
+          <w:p>
+            <w:pPr>
+              <w:pStyle w:val="Compact"/>
+            </w:pPr>
+            <w:r>
+              <w:t xml:space="preserve">Method</w:t>
+            </w:r>
+          </w:p>
+        </w:tc>
+        <w:tc>
+          <w:tcPr/>
+          <w:p>
+            <w:pPr>
+              <w:pStyle w:val="Compact"/>
+            </w:pPr>
+            <w:r>
+              <w:t xml:space="preserve">Cost</w:t>
+            </w:r>
+          </w:p>
+        </w:tc>
+        <w:tc>
+          <w:tcPr/>
+          <w:p>
+            <w:pPr>
+              <w:pStyle w:val="Compact"/>
+            </w:pPr>
+            <w:r>
+              <w:t xml:space="preserve">Viol-h</w:t>
+            </w:r>
+          </w:p>
+        </w:tc>
+        <w:tc>
+          <w:tcPr/>
+          <w:p>
+            <w:pPr>
+              <w:pStyle w:val="Compact"/>
+            </w:pPr>
+            <w:r>
+              <w:t xml:space="preserve">Term-gap</w:t>
+            </w:r>
+          </w:p>
+        </w:tc>
+        <w:tc>
+          <w:tcPr/>
+          <w:p>
+            <w:pPr>
+              <w:pStyle w:val="Compact"/>
+            </w:pPr>
+            <w:r>
+              <w:t xml:space="preserve">Latency</w:t>
+            </w:r>
+          </w:p>
+        </w:tc>
+      </w:tr>
+      <w:tr>
+        <w:tc>
+          <w:tcPr/>
+          <w:p>
+            <w:pPr>
+              <w:pStyle w:val="Compact"/>
+            </w:pPr>
+            <w:r>
+              <w:t xml:space="preserve">GA (optimum ref)</w:t>
+            </w:r>
+          </w:p>
+        </w:tc>
+        <w:tc>
+          <w:tcPr/>
+          <w:p>
+            <w:pPr>
+              <w:pStyle w:val="Compact"/>
+            </w:pPr>
+            <w:r>
+              <w:t xml:space="preserve">5.57</w:t>
+            </w:r>
+          </w:p>
+        </w:tc>
+        <w:tc>
+          <w:tcPr/>
+          <w:p>
+            <w:pPr>
+              <w:pStyle w:val="Compact"/>
+            </w:pPr>
+            <w:r>
+              <w:t xml:space="preserve">0</w:t>
+            </w:r>
+          </w:p>
+        </w:tc>
+        <w:tc>
+          <w:tcPr/>
+          <w:p>
+            <w:pPr>
+              <w:pStyle w:val="Compact"/>
+            </w:pPr>
+            <w:r>
+              <w:t xml:space="preserve">5</w:t>
+            </w:r>
+          </w:p>
+        </w:tc>
+        <w:tc>
+          <w:tcPr/>
+          <w:p>
+            <w:pPr>
+              <w:pStyle w:val="Compact"/>
+            </w:pPr>
+            <w:r>
+              <w:t xml:space="preserve">11.9 s</w:t>
+            </w:r>
+          </w:p>
+        </w:tc>
+      </w:tr>
+      <w:tr>
+        <w:tc>
+          <w:tcPr/>
+          <w:p>
+            <w:pPr>
+              <w:pStyle w:val="Compact"/>
+            </w:pPr>
+            <w:r>
+              <w:rPr>
+                <w:b/>
+                <w:bCs/>
+              </w:rPr>
+              <w:t xml:space="preserve">Distilled-MPC</w:t>
+            </w:r>
+          </w:p>
+        </w:tc>
+        <w:tc>
+          <w:tcPr/>
+          <w:p>
+            <w:pPr>
+              <w:pStyle w:val="Compact"/>
+            </w:pPr>
+            <w:r>
+              <w:rPr>
+                <w:b/>
+                <w:bCs/>
+              </w:rPr>
+              <w:t xml:space="preserve">5.26</w:t>
+            </w:r>
+          </w:p>
+        </w:tc>
+        <w:tc>
+          <w:tcPr/>
+          <w:p>
+            <w:pPr>
+              <w:pStyle w:val="Compact"/>
+            </w:pPr>
+            <w:r>
+              <w:rPr>
+                <w:b/>
+                <w:bCs/>
+              </w:rPr>
+              <w:t xml:space="preserve">0</w:t>
+            </w:r>
+          </w:p>
+        </w:tc>
+        <w:tc>
+          <w:tcPr/>
+          <w:p>
+            <w:pPr>
+              <w:pStyle w:val="Compact"/>
+            </w:pPr>
+            <w:r>
+              <w:t xml:space="preserve">111</w:t>
+            </w:r>
+          </w:p>
+        </w:tc>
+        <w:tc>
+          <w:tcPr/>
+          <w:p>
+            <w:pPr>
+              <w:pStyle w:val="Compact"/>
+            </w:pPr>
+            <w:r>
+              <w:rPr>
+                <w:b/>
+                <w:bCs/>
+              </w:rPr>
+              <w:t xml:space="preserve">2.8 ms</w:t>
+            </w:r>
+          </w:p>
+        </w:tc>
+      </w:tr>
+      <w:tr>
+        <w:tc>
+          <w:tcPr/>
+          <w:p>
+            <w:pPr>
+              <w:pStyle w:val="Compact"/>
+            </w:pPr>
+            <w:r>
+              <w:t xml:space="preserve">DP / MPC</w:t>
+            </w:r>
+          </w:p>
+        </w:tc>
+        <w:tc>
+          <w:tcPr/>
+          <w:p>
+            <w:pPr>
+              <w:pStyle w:val="Compact"/>
+            </w:pPr>
+            <w:r>
+              <w:t xml:space="preserve">6.70</w:t>
+            </w:r>
+          </w:p>
+        </w:tc>
+        <w:tc>
+          <w:tcPr/>
+          <w:p>
+            <w:pPr>
+              <w:pStyle w:val="Compact"/>
+            </w:pPr>
+            <w:r>
+              <w:t xml:space="preserve">0</w:t>
+            </w:r>
+          </w:p>
+        </w:tc>
+        <w:tc>
+          <w:tcPr/>
+          <w:p>
+            <w:pPr>
+              <w:pStyle w:val="Compact"/>
+            </w:pPr>
+            <w:r>
+              <w:t xml:space="preserve">141</w:t>
+            </w:r>
+          </w:p>
+        </w:tc>
+        <w:tc>
+          <w:tcPr/>
+          <w:p>
+            <w:pPr>
+              <w:pStyle w:val="Compact"/>
+            </w:pPr>
+            <w:r>
+              <w:t xml:space="preserve">6.5 s</w:t>
+            </w:r>
+          </w:p>
+        </w:tc>
+      </w:tr>
+      <w:tr>
+        <w:tc>
+          <w:tcPr/>
+          <w:p>
+            <w:pPr>
+              <w:pStyle w:val="Compact"/>
+            </w:pPr>
+            <w:r>
+              <w:t xml:space="preserve">Constrained-SAC</w:t>
+            </w:r>
+          </w:p>
+        </w:tc>
+        <w:tc>
+          <w:tcPr/>
+          <w:p>
+            <w:pPr>
+              <w:pStyle w:val="Compact"/>
+            </w:pPr>
+            <w:r>
+              <w:t xml:space="preserve">17.08</w:t>
+            </w:r>
+          </w:p>
+        </w:tc>
+        <w:tc>
+          <w:tcPr/>
+          <w:p>
+            <w:pPr>
+              <w:pStyle w:val="Compact"/>
+            </w:pPr>
+            <w:r>
+              <w:t xml:space="preserve">0</w:t>
+            </w:r>
+          </w:p>
+        </w:tc>
+        <w:tc>
+          <w:tcPr/>
+          <w:p>
+            <w:pPr>
+              <w:pStyle w:val="Compact"/>
+            </w:pPr>
+            <w:r>
+              <w:t xml:space="preserve">66</w:t>
+            </w:r>
+          </w:p>
+        </w:tc>
+        <w:tc>
+          <w:tcPr/>
+          <w:p>
+            <w:pPr>
+              <w:pStyle w:val="Compact"/>
+            </w:pPr>
+            <w:r>
+              <w:t xml:space="preserve">4.7 ms</w:t>
+            </w:r>
+          </w:p>
+        </w:tc>
+      </w:tr>
+      <w:tr>
+        <w:tc>
+          <w:tcPr/>
+          <w:p>
+            <w:pPr>
+              <w:pStyle w:val="Compact"/>
+            </w:pPr>
+            <w:r>
+              <w:t xml:space="preserve">SAC</w:t>
+            </w:r>
+          </w:p>
+        </w:tc>
+        <w:tc>
+          <w:tcPr/>
+          <w:p>
+            <w:pPr>
+              <w:pStyle w:val="Compact"/>
+            </w:pPr>
+            <w:r>
+              <w:t xml:space="preserve">16.07</w:t>
+            </w:r>
+          </w:p>
+        </w:tc>
+        <w:tc>
+          <w:tcPr/>
+          <w:p>
+            <w:pPr>
+              <w:pStyle w:val="Compact"/>
+            </w:pPr>
+            <w:r>
+              <w:t xml:space="preserve">0</w:t>
+            </w:r>
+          </w:p>
+        </w:tc>
+        <w:tc>
+          <w:tcPr/>
+          <w:p>
+            <w:pPr>
+              <w:pStyle w:val="Compact"/>
+            </w:pPr>
+            <w:r>
+              <w:t xml:space="preserve">300</w:t>
+            </w:r>
+          </w:p>
+        </w:tc>
+        <w:tc>
+          <w:tcPr/>
+          <w:p>
+            <w:pPr>
+              <w:pStyle w:val="Compact"/>
+            </w:pPr>
+            <w:r>
+              <w:t xml:space="preserve">4.9 ms</w:t>
+            </w:r>
+          </w:p>
+        </w:tc>
+      </w:tr>
+    </w:tbl>
+    <w:p>
+      <w:pPr>
+        <w:pStyle w:val="BodyText"/>
+      </w:pPr>
+      <w:r>
+        <w:t xml:space="preserve">On the real-geometry network the distilled controller is the best learned method outright (matches the GA optimum, beats MPC, 0 violations, ms latency).</w:t>
+      </w:r>
+    </w:p>
+    <w:p>
+      <w:pPr>
+        <w:pStyle w:val="BodyText"/>
+      </w:pPr>
+      <w:r>
+        <w:t xml:space="preserve">Honest caveats (in the paper): the constraint-aware-SAC ranking is network-dependent (it wins on the gun-barrel and GasLib nets, loses on the branched one); the branched 3-D grid DP/MPC are grid-limited (~2 violations) so GA is the clean reference there; TD3 degenerates (never compresses → depletes line-pack), which the terminal-gap column exposes; the GasLib geometry needed affine recalibration for numerical stability and the TOU price stays synthetic (GasLib is gas-only).</w:t>
       </w:r>
     </w:p>
     <w:bookmarkEnd w:id="11"/>
@@ -1102,6 +1500,18 @@
         <w:t xml:space="preserve">branched_benchmark_config()</w:t>
       </w:r>
       <w:r>
+        <w:t xml:space="preserve">,</w:t>
+      </w:r>
+      <w:r>
+        <w:t xml:space="preserve"> </w:t>
+      </w:r>
+      <w:r>
+        <w:rPr>
+          <w:rStyle w:val="VerbatimChar"/>
+        </w:rPr>
+        <w:t xml:space="preserve">gaslib_benchmark_config()</w:t>
+      </w:r>
+      <w:r>
         <w:t xml:space="preserve">.</w:t>
       </w:r>
     </w:p>
@@ -1279,7 +1689,7 @@
         <w:t xml:space="preserve"> </w:t>
       </w:r>
       <w:r>
-        <w:t xml:space="preserve">(gun-barrel) and</w:t>
+        <w:t xml:space="preserve">(gun-barrel),</w:t>
       </w:r>
       <w:r>
         <w:t xml:space="preserve"> </w:t>
@@ -1291,7 +1701,46 @@
         <w:t xml:space="preserve">models/exports/paper_branched/</w:t>
       </w:r>
       <w:r>
-        <w:t xml:space="preserve">.</w:t>
+        <w:t xml:space="preserve">,</w:t>
+      </w:r>
+      <w:r>
+        <w:t xml:space="preserve"> </w:t>
+      </w:r>
+      <w:r>
+        <w:rPr>
+          <w:rStyle w:val="VerbatimChar"/>
+        </w:rPr>
+        <w:t xml:space="preserve">models/exports/paper_gaslib/</w:t>
+      </w:r>
+      <w:r>
+        <w:t xml:space="preserve">; all raw data bundled in</w:t>
+      </w:r>
+      <w:r>
+        <w:t xml:space="preserve"> </w:t>
+      </w:r>
+      <w:r>
+        <w:rPr>
+          <w:rStyle w:val="VerbatimChar"/>
+        </w:rPr>
+        <w:t xml:space="preserve">raw_data/</w:t>
+      </w:r>
+      <w:r>
+        <w:t xml:space="preserve"> </w:t>
+      </w:r>
+      <w:r>
+        <w:t xml:space="preserve">(+</w:t>
+      </w:r>
+      <w:r>
+        <w:t xml:space="preserve"> </w:t>
+      </w:r>
+      <w:r>
+        <w:rPr>
+          <w:rStyle w:val="VerbatimChar"/>
+        </w:rPr>
+        <w:t xml:space="preserve">raw_data.zip</w:t>
+      </w:r>
+      <w:r>
+        <w:t xml:space="preserve">).</w:t>
       </w:r>
     </w:p>
     <w:bookmarkEnd w:id="12"/>
@@ -1457,6 +1906,75 @@
           <w:rStyle w:val="NormalTok"/>
         </w:rPr>
         <w:t xml:space="preserve"> 12</w:t>
+      </w:r>
+      <w:r>
+        <w:br/>
+      </w:r>
+      <w:r>
+        <w:rPr>
+          <w:rStyle w:val="ExtensionTok"/>
+        </w:rPr>
+        <w:t xml:space="preserve">python</w:t>
+      </w:r>
+      <w:r>
+        <w:rPr>
+          <w:rStyle w:val="NormalTok"/>
+        </w:rPr>
+        <w:t xml:space="preserve"> run_experiments.py </w:t>
+      </w:r>
+      <w:r>
+        <w:rPr>
+          <w:rStyle w:val="AttributeTok"/>
+        </w:rPr>
+        <w:t xml:space="preserve">--network</w:t>
+      </w:r>
+      <w:r>
+        <w:rPr>
+          <w:rStyle w:val="NormalTok"/>
+        </w:rPr>
+        <w:t xml:space="preserve"> gaslib   </w:t>
+      </w:r>
+      <w:r>
+        <w:rPr>
+          <w:rStyle w:val="AttributeTok"/>
+        </w:rPr>
+        <w:t xml:space="preserve">--steps</w:t>
+      </w:r>
+      <w:r>
+        <w:rPr>
+          <w:rStyle w:val="NormalTok"/>
+        </w:rPr>
+        <w:t xml:space="preserve"> 150000 </w:t>
+      </w:r>
+      <w:r>
+        <w:rPr>
+          <w:rStyle w:val="AttributeTok"/>
+        </w:rPr>
+        <w:t xml:space="preserve">--seeds</w:t>
+      </w:r>
+      <w:r>
+        <w:rPr>
+          <w:rStyle w:val="NormalTok"/>
+        </w:rPr>
+        <w:t xml:space="preserve"> 3 </w:t>
+      </w:r>
+      <w:r>
+        <w:rPr>
+          <w:rStyle w:val="AttributeTok"/>
+        </w:rPr>
+        <w:t xml:space="preserve">--dagger</w:t>
+      </w:r>
+      <w:r>
+        <w:rPr>
+          <w:rStyle w:val="NormalTok"/>
+        </w:rPr>
+        <w:t xml:space="preserve"> 12  </w:t>
+      </w:r>
+      <w:r>
+        <w:rPr>
+          <w:rStyle w:val="CommentTok"/>
+        </w:rPr>
+        <w:t xml:space="preserve"># GasLib-40 geometry</w:t>
       </w:r>
       <w:r>
         <w:br/>

</xml_diff>

<commit_message>
5-seed gun-barrel Table 1 + ablation study (§6.7)
- Gun-barrel rerun at 5 seeds (tighter CIs). The cleaner stats resolve an earlier
  low-seed fluke: GA is 5.51±2.3 (high variance) ≈ DP/MPC 5.38, not "undercutting" it.
  Distilled-MPC 5.13±0.4 is now the cheapest at near-feasibility (gap -4.6% vs DP).
  Updated Table 1 + all dependent prose numbers (abstract, §6.2/6.3, conclusion).
- Ablation study (§6.7, Table 1b): removing the feasibility-aware realisation brings
  violations back (0->6, cost 2x, terminal gap 2402); removing the soft margin LOWERS
  cost (13.7->5.89) at 0 violations (it is the main cost-premium cause); the fixed-weight
  surge/terminal penalties are inert for Constrained-SAC (the Lagrangian does the work).
- raw_data/: 5-seed gun-barrel (231 records) + ablations.csv; refreshed zip + docx.
- ablations.py + enable_feasibility_realization env switch.

Co-Authored-By: Claude Opus 4.8 <noreply@anthropic.com>
</commit_message>
<xml_diff>
--- a/paper/PR_summary.docx
+++ b/paper/PR_summary.docx
@@ -2,7 +2,7 @@
 <file path=word/document.xml><?xml version="1.0" encoding="utf-8"?>
 <w:document xmlns:w="http://schemas.openxmlformats.org/wordprocessingml/2006/main" xmlns:m="http://schemas.openxmlformats.org/officeDocument/2006/math" xmlns:r="http://schemas.openxmlformats.org/officeDocument/2006/relationships" xmlns:o="urn:schemas-microsoft-com:office:office" xmlns:v="urn:schemas-microsoft-com:vml" xmlns:w10="urn:schemas-microsoft-com:office:word" xmlns:a="http://schemas.openxmlformats.org/drawingml/2006/main" xmlns:pic="http://schemas.openxmlformats.org/drawingml/2006/picture" xmlns:wp="http://schemas.openxmlformats.org/drawingml/2006/wordprocessingDrawing">
   <w:body>
-    <w:bookmarkStart w:id="15" w:name="Xf34669edf12f4bd6e9b57095b2bd98b3cc383fd"/>
+    <w:bookmarkStart w:id="16" w:name="Xf34669edf12f4bd6e9b57095b2bd98b3cc383fd"/>
     <w:p>
       <w:pPr>
         <w:pStyle w:val="Heading1"/>
@@ -1999,13 +1999,13 @@
       </w:r>
     </w:p>
     <w:bookmarkEnd w:id="13"/>
-    <w:bookmarkStart w:id="14" w:name="status"/>
+    <w:bookmarkStart w:id="14" w:name="ablations-gun-barrel-6.7"/>
     <w:p>
       <w:pPr>
         <w:pStyle w:val="Heading2"/>
       </w:pPr>
       <w:r>
-        <w:t xml:space="preserve">Status</w:t>
+        <w:t xml:space="preserve">Ablations (gun-barrel, §6.7)</w:t>
       </w:r>
     </w:p>
     <w:p>
@@ -2013,11 +2013,111 @@
         <w:pStyle w:val="FirstParagraph"/>
       </w:pPr>
       <w:r>
-        <w:t xml:space="preserve">Reduced-but-real budget (150k steps / 3 seeds) — numbers are genuine but not camera-ready. The remaining credibility lift is a field / GasLib-derived network with measured load and price; the branched benchmark is a step toward that.</w:t>
+        <w:t xml:space="preserve">Removing one Constrained-SAC component at a time:</w:t>
+      </w:r>
+      <w:r>
+        <w:t xml:space="preserve"> </w:t>
+      </w:r>
+      <w:r>
+        <w:t xml:space="preserve">-</w:t>
+      </w:r>
+      <w:r>
+        <w:t xml:space="preserve"> </w:t>
+      </w:r>
+      <w:r>
+        <w:rPr>
+          <w:b/>
+          <w:bCs/>
+        </w:rPr>
+        <w:t xml:space="preserve">− feasibility-aware action realisation → 6 violation-h, cost 2× (30.3), terminal gap 2402</w:t>
+      </w:r>
+      <w:r>
+        <w:t xml:space="preserve"> </w:t>
+      </w:r>
+      <w:r>
+        <w:t xml:space="preserve">— confirms it is the enabler.</w:t>
+      </w:r>
+      <w:r>
+        <w:t xml:space="preserve"> </w:t>
+      </w:r>
+      <w:r>
+        <w:t xml:space="preserve">-</w:t>
+      </w:r>
+      <w:r>
+        <w:t xml:space="preserve"> </w:t>
+      </w:r>
+      <w:r>
+        <w:rPr>
+          <w:b/>
+          <w:bCs/>
+        </w:rPr>
+        <w:t xml:space="preserve">− soft pressure margin → cost drops 13.7 → 5.89, still 0 violations</w:t>
+      </w:r>
+      <w:r>
+        <w:t xml:space="preserve"> </w:t>
+      </w:r>
+      <w:r>
+        <w:t xml:space="preserve">— the margin (a learning aid) is the main cause of the from-scratch cost premium; it can be dropped/annealed once trained.</w:t>
+      </w:r>
+      <w:r>
+        <w:t xml:space="preserve"> </w:t>
+      </w:r>
+      <w:r>
+        <w:t xml:space="preserve">-</w:t>
+      </w:r>
+      <w:r>
+        <w:t xml:space="preserve"> </w:t>
+      </w:r>
+      <w:r>
+        <w:rPr>
+          <w:b/>
+          <w:bCs/>
+        </w:rPr>
+        <w:t xml:space="preserve">− surge / − terminal penalty weight → no effect</w:t>
+      </w:r>
+      <w:r>
+        <w:t xml:space="preserve"> </w:t>
+      </w:r>
+      <w:r>
+        <w:t xml:space="preserve">— Constrained-SAC ignores the fixed-weight penalty and derives feasibility from the single normalised constraint cost (the Lagrangian, not hand-tuned weights, does the work).</w:t>
       </w:r>
     </w:p>
     <w:bookmarkEnd w:id="14"/>
+    <w:bookmarkStart w:id="15" w:name="status"/>
+    <w:p>
+      <w:pPr>
+        <w:pStyle w:val="Heading2"/>
+      </w:pPr>
+      <w:r>
+        <w:t xml:space="preserve">Status</w:t>
+      </w:r>
+    </w:p>
+    <w:p>
+      <w:pPr>
+        <w:pStyle w:val="FirstParagraph"/>
+      </w:pPr>
+      <w:r>
+        <w:t xml:space="preserve">Reduced-but-real budget (150k steps;</w:t>
+      </w:r>
+      <w:r>
+        <w:t xml:space="preserve"> </w:t>
+      </w:r>
+      <w:r>
+        <w:rPr>
+          <w:b/>
+          <w:bCs/>
+        </w:rPr>
+        <w:t xml:space="preserve">5 seeds gun-barrel</w:t>
+      </w:r>
+      <w:r>
+        <w:t xml:space="preserve"> </w:t>
+      </w:r>
+      <w:r>
+        <w:t xml:space="preserve">/ 3 seeds benchmarks) — numbers are genuine but not camera-ready. The remaining credibility lift is a field / GasLib-derived network with measured load and price; the branched benchmark is a step toward that.</w:t>
+      </w:r>
+    </w:p>
     <w:bookmarkEnd w:id="15"/>
+    <w:bookmarkEnd w:id="16"/>
     <w:sectPr>
       <w:footnotePr>
         <w:numRestart w:val="eachSect"/>

</xml_diff>